<commit_message>
Updated Lab 1 document
Added GitHub Repo link
</commit_message>
<xml_diff>
--- a/docs/Lab 1 – Anomaly Detection.docx
+++ b/docs/Lab 1 – Anomaly Detection.docx
@@ -75,17 +75,52 @@
           <w:sz w:val="32"/>
           <w:szCs w:val="32"/>
         </w:rPr>
-        <w:t>PROG8245</w:t>
+        <w:t>PROG8245 – Machine Learning Frameworks</w:t>
       </w:r>
-      <w:r>
+    </w:p>
+    <w:p>
+      <w:pPr>
         <w:rPr>
           <w:b/>
           <w:bCs/>
           <w:sz w:val="32"/>
           <w:szCs w:val="32"/>
         </w:rPr>
-        <w:t xml:space="preserve"> – Machine Learning Frameworks</w:t>
+      </w:pPr>
+    </w:p>
+    <w:p>
+      <w:pPr>
+        <w:rPr>
+          <w:sz w:val="28"/>
+          <w:szCs w:val="28"/>
+        </w:rPr>
+      </w:pPr>
+      <w:r>
+        <w:rPr>
+          <w:b/>
+          <w:bCs/>
+          <w:sz w:val="28"/>
+          <w:szCs w:val="28"/>
+        </w:rPr>
+        <w:t>GitHub Repo</w:t>
       </w:r>
+      <w:r>
+        <w:rPr>
+          <w:sz w:val="28"/>
+          <w:szCs w:val="28"/>
+        </w:rPr>
+        <w:t xml:space="preserve"> - </w:t>
+      </w:r>
+      <w:hyperlink r:id="rId4" w:history="1">
+        <w:r>
+          <w:rPr>
+            <w:rStyle w:val="Hyperlink"/>
+            <w:sz w:val="28"/>
+            <w:szCs w:val="28"/>
+          </w:rPr>
+          <w:t>https://github.com/DavisenV/PROG8245-Lab1.git</w:t>
+        </w:r>
+      </w:hyperlink>
     </w:p>
     <w:p/>
     <w:tbl>
@@ -1143,6 +1178,7 @@
   <w:style w:type="character" w:default="1" w:styleId="DefaultParagraphFont">
     <w:name w:val="Default Paragraph Font"/>
     <w:uiPriority w:val="1"/>
+    <w:semiHidden/>
     <w:unhideWhenUsed/>
   </w:style>
   <w:style w:type="table" w:default="1" w:styleId="TableNormal">
@@ -1475,6 +1511,29 @@
         <w:insideV w:val="single" w:sz="4" w:space="0" w:color="auto"/>
       </w:tblBorders>
     </w:tblPr>
+  </w:style>
+  <w:style w:type="character" w:styleId="Hyperlink">
+    <w:name w:val="Hyperlink"/>
+    <w:basedOn w:val="DefaultParagraphFont"/>
+    <w:uiPriority w:val="99"/>
+    <w:unhideWhenUsed/>
+    <w:rsid w:val="00791A8A"/>
+    <w:rPr>
+      <w:color w:val="0563C1" w:themeColor="hyperlink"/>
+      <w:u w:val="single"/>
+    </w:rPr>
+  </w:style>
+  <w:style w:type="character" w:styleId="UnresolvedMention">
+    <w:name w:val="Unresolved Mention"/>
+    <w:basedOn w:val="DefaultParagraphFont"/>
+    <w:uiPriority w:val="99"/>
+    <w:semiHidden/>
+    <w:unhideWhenUsed/>
+    <w:rsid w:val="00791A8A"/>
+    <w:rPr>
+      <w:color w:val="605E5C"/>
+      <w:shd w:val="clear" w:color="auto" w:fill="E1DFDD"/>
+    </w:rPr>
   </w:style>
 </w:styles>
 </file>

</xml_diff>

<commit_message>
Added VS Code Terminal Screenshot
</commit_message>
<xml_diff>
--- a/docs/Lab 1 – Anomaly Detection.docx
+++ b/docs/Lab 1 – Anomaly Detection.docx
@@ -83,8 +83,6 @@
         <w:rPr>
           <w:b/>
           <w:bCs/>
-          <w:sz w:val="32"/>
-          <w:szCs w:val="32"/>
         </w:rPr>
       </w:pPr>
     </w:p>
@@ -306,7 +304,6 @@
               <w:t>.</w:t>
             </w:r>
           </w:p>
-          <w:p/>
           <w:p>
             <w:pPr>
               <w:rPr>
@@ -330,7 +327,6 @@
               <w:t>The result is not always empty; values different from the sample mean are flagged.</w:t>
             </w:r>
           </w:p>
-          <w:p/>
           <w:p>
             <w:pPr>
               <w:rPr>
@@ -351,24 +347,9 @@
               <w:rPr>
                 <w:lang w:val="en-CA"/>
               </w:rPr>
-              <w:t xml:space="preserve">The function can return several transactions, </w:t>
-            </w:r>
-            <w:proofErr w:type="gramStart"/>
-            <w:r>
-              <w:rPr>
-                <w:lang w:val="en-CA"/>
-              </w:rPr>
-              <w:t>not only the</w:t>
-            </w:r>
-            <w:proofErr w:type="gramEnd"/>
-            <w:r>
-              <w:rPr>
-                <w:lang w:val="en-CA"/>
-              </w:rPr>
-              <w:t xml:space="preserve"> largest one.</w:t>
+              <w:t>The function can return several transactions, not only the largest one.</w:t>
             </w:r>
           </w:p>
-          <w:p/>
           <w:p>
             <w:pPr>
               <w:rPr>
@@ -392,7 +373,6 @@
               <w:t>Middle-valued anomalies can also be returned, so only extremes are not guaranteed.</w:t>
             </w:r>
           </w:p>
-          <w:p/>
           <w:p>
             <w:pPr>
               <w:rPr>
@@ -416,7 +396,6 @@
               <w:t>Transactions equal to the sample mean are removed, so the list is modified.</w:t>
             </w:r>
           </w:p>
-          <w:p/>
           <w:p>
             <w:pPr>
               <w:rPr>
@@ -464,7 +443,6 @@
               <w:t>, not less than it.</w:t>
             </w:r>
           </w:p>
-          <w:p/>
           <w:p>
             <w:pPr>
               <w:rPr>
@@ -497,24 +475,9 @@
               <w:rPr>
                 <w:lang w:val="en-CA"/>
               </w:rPr>
-              <w:t>σ` to zero for a one-element sample, avoiding `</w:t>
-            </w:r>
-            <w:proofErr w:type="spellStart"/>
-            <w:r>
-              <w:rPr>
-                <w:lang w:val="en-CA"/>
-              </w:rPr>
-              <w:t>ValueError</w:t>
-            </w:r>
-            <w:proofErr w:type="spellEnd"/>
-            <w:r>
-              <w:rPr>
-                <w:lang w:val="en-CA"/>
-              </w:rPr>
-              <w:t>`.</w:t>
+              <w:t>σ` to zero for a one-element sample, avoiding `ValueError`.</w:t>
             </w:r>
           </w:p>
-          <w:p/>
           <w:p>
             <w:pPr>
               <w:rPr>
@@ -538,7 +501,6 @@
               <w:t>A list comprehension returns every qualifying transaction, not just the first one.</w:t>
             </w:r>
           </w:p>
-          <w:p/>
           <w:p>
             <w:pPr>
               <w:rPr>
@@ -566,7 +528,55 @@
         </w:tc>
       </w:tr>
     </w:tbl>
-    <w:p/>
+    <w:p>
+      <w:pPr>
+        <w:rPr>
+          <w:noProof/>
+        </w:rPr>
+      </w:pPr>
+    </w:p>
+    <w:p>
+      <w:r>
+        <w:rPr>
+          <w:noProof/>
+        </w:rPr>
+        <w:drawing>
+          <wp:inline distT="0" distB="0" distL="0" distR="0" wp14:anchorId="168DC7EF" wp14:editId="3EF73773">
+            <wp:extent cx="5943600" cy="741680"/>
+            <wp:effectExtent l="0" t="0" r="0" b="1270"/>
+            <wp:docPr id="1587702365" name="Picture 1"/>
+            <wp:cNvGraphicFramePr>
+              <a:graphicFrameLocks xmlns:a="http://schemas.openxmlformats.org/drawingml/2006/main" noChangeAspect="1"/>
+            </wp:cNvGraphicFramePr>
+            <a:graphic xmlns:a="http://schemas.openxmlformats.org/drawingml/2006/main">
+              <a:graphicData uri="http://schemas.openxmlformats.org/drawingml/2006/picture">
+                <pic:pic xmlns:pic="http://schemas.openxmlformats.org/drawingml/2006/picture">
+                  <pic:nvPicPr>
+                    <pic:cNvPr id="1587702365" name=""/>
+                    <pic:cNvPicPr/>
+                  </pic:nvPicPr>
+                  <pic:blipFill>
+                    <a:blip r:embed="rId5"/>
+                    <a:stretch>
+                      <a:fillRect/>
+                    </a:stretch>
+                  </pic:blipFill>
+                  <pic:spPr>
+                    <a:xfrm>
+                      <a:off x="0" y="0"/>
+                      <a:ext cx="5943600" cy="741680"/>
+                    </a:xfrm>
+                    <a:prstGeom prst="rect">
+                      <a:avLst/>
+                    </a:prstGeom>
+                  </pic:spPr>
+                </pic:pic>
+              </a:graphicData>
+            </a:graphic>
+          </wp:inline>
+        </w:drawing>
+      </w:r>
+    </w:p>
     <w:sectPr>
       <w:pgSz w:w="12240" w:h="15840"/>
       <w:pgMar w:top="1440" w:right="1440" w:bottom="1440" w:left="1440" w:header="720" w:footer="720" w:gutter="0"/>

</xml_diff>